<commit_message>
Adding markdown files from my docusarus project; adding markdown and markdown cli demo directories
</commit_message>
<xml_diff>
--- a/Documentation-Quality-Pipeline-Case-Study.docx
+++ b/Documentation-Quality-Pipeline-Case-Study.docx
@@ -14,14 +14,21 @@
       <w:pPr>
         <w:pStyle w:val="Heading1"/>
       </w:pPr>
+      <w:proofErr w:type="spellStart"/>
       <w:r>
         <w:t>HTMLHint</w:t>
       </w:r>
-    </w:p>
-    <w:p>
-      <w:r>
-        <w:t>Installed HTMLHint</w:t>
-      </w:r>
+      <w:proofErr w:type="spellEnd"/>
+    </w:p>
+    <w:p>
+      <w:r>
+        <w:t xml:space="preserve">Installed </w:t>
+      </w:r>
+      <w:proofErr w:type="spellStart"/>
+      <w:r>
+        <w:t>HTMLHint</w:t>
+      </w:r>
+      <w:proofErr w:type="spellEnd"/>
     </w:p>
     <w:p>
       <w:r>
@@ -29,6 +36,7 @@
       </w:r>
     </w:p>
     <w:p>
+      <w:proofErr w:type="gramStart"/>
       <w:r>
         <w:t xml:space="preserve">Created </w:t>
       </w:r>
@@ -37,20 +45,59 @@
           <w:b/>
           <w:bCs/>
         </w:rPr>
-        <w:t>.htmlhintrc</w:t>
-      </w:r>
+        <w:t>.</w:t>
+      </w:r>
+      <w:proofErr w:type="spellStart"/>
+      <w:r>
+        <w:rPr>
+          <w:b/>
+          <w:bCs/>
+        </w:rPr>
+        <w:t>htmlhintrc</w:t>
+      </w:r>
+      <w:proofErr w:type="spellEnd"/>
+      <w:proofErr w:type="gramEnd"/>
       <w:r>
         <w:t xml:space="preserve"> with default rules</w:t>
       </w:r>
     </w:p>
     <w:p>
       <w:r>
-        <w:t>Ran HTMLHint on all HTML files in demo project</w:t>
-      </w:r>
-    </w:p>
-    <w:p>
-      <w:r>
-        <w:t xml:space="preserve">Added VS Code schema support to have config file recognized by editors with JSON schema support to enable autocompletion and validation for the .htmlhintrc file. </w:t>
+        <w:t xml:space="preserve">Ran </w:t>
+      </w:r>
+      <w:proofErr w:type="spellStart"/>
+      <w:r>
+        <w:t>HTMLHint</w:t>
+      </w:r>
+      <w:proofErr w:type="spellEnd"/>
+      <w:r>
+        <w:t xml:space="preserve"> on all HTML files in demo project</w:t>
+      </w:r>
+    </w:p>
+    <w:p>
+      <w:r>
+        <w:t xml:space="preserve">Added VS Code schema support to have config </w:t>
+      </w:r>
+      <w:proofErr w:type="gramStart"/>
+      <w:r>
+        <w:t>file</w:t>
+      </w:r>
+      <w:proofErr w:type="gramEnd"/>
+      <w:r>
+        <w:t xml:space="preserve"> recognized by editors with JSON schema support to enable autocompletion and validation for </w:t>
+      </w:r>
+      <w:proofErr w:type="gramStart"/>
+      <w:r>
+        <w:t>the .</w:t>
+      </w:r>
+      <w:proofErr w:type="spellStart"/>
+      <w:r>
+        <w:t>htmlhintrc</w:t>
+      </w:r>
+      <w:proofErr w:type="spellEnd"/>
+      <w:proofErr w:type="gramEnd"/>
+      <w:r>
+        <w:t xml:space="preserve"> file. </w:t>
       </w:r>
     </w:p>
     <w:p>
@@ -141,11 +188,30 @@
     <w:p/>
     <w:p>
       <w:r>
-        <w:t>I created a custom HTMLHint configuration file which ensured no style tags cannot be used inside the html. Only references to an external css file can be used. D</w:t>
-      </w:r>
-    </w:p>
-    <w:p>
-      <w:r>
+        <w:t xml:space="preserve">I created a custom </w:t>
+      </w:r>
+      <w:proofErr w:type="spellStart"/>
+      <w:r>
+        <w:t>HTMLHint</w:t>
+      </w:r>
+      <w:proofErr w:type="spellEnd"/>
+      <w:r>
+        <w:t xml:space="preserve"> configuration file which ensured no style tags cannot be used inside the html. Only references to an external </w:t>
+      </w:r>
+      <w:proofErr w:type="spellStart"/>
+      <w:r>
+        <w:t>css</w:t>
+      </w:r>
+      <w:proofErr w:type="spellEnd"/>
+      <w:r>
+        <w:t xml:space="preserve"> file can be used. D</w:t>
+      </w:r>
+    </w:p>
+    <w:p>
+      <w:r>
+        <w:rPr>
+          <w:noProof/>
+        </w:rPr>
         <w:drawing>
           <wp:inline distT="0" distB="0" distL="0" distR="0" wp14:anchorId="365DE68B" wp14:editId="2D05B144">
             <wp:extent cx="5943600" cy="1066165"/>
@@ -185,6 +251,9 @@
     </w:p>
     <w:p>
       <w:r>
+        <w:rPr>
+          <w:noProof/>
+        </w:rPr>
         <w:drawing>
           <wp:inline distT="0" distB="0" distL="0" distR="0" wp14:anchorId="4353B3EF" wp14:editId="7D2AA0BA">
             <wp:extent cx="2581635" cy="762106"/>
@@ -224,6 +293,9 @@
     </w:p>
     <w:p>
       <w:r>
+        <w:rPr>
+          <w:noProof/>
+        </w:rPr>
         <w:lastRenderedPageBreak/>
         <w:drawing>
           <wp:inline distT="0" distB="0" distL="0" distR="0" wp14:anchorId="62E77B23" wp14:editId="22475182">
@@ -267,10 +339,26 @@
         <w:t xml:space="preserve">I removed the style section from the HTML file </w:t>
       </w:r>
       <w:r>
-        <w:t xml:space="preserve">and put the css in a separate file </w:t>
-      </w:r>
-      <w:r>
-        <w:t xml:space="preserve">and reran the HTMLHint command </w:t>
+        <w:t xml:space="preserve">and put the </w:t>
+      </w:r>
+      <w:proofErr w:type="spellStart"/>
+      <w:r>
+        <w:t>css</w:t>
+      </w:r>
+      <w:proofErr w:type="spellEnd"/>
+      <w:r>
+        <w:t xml:space="preserve"> in a separate file </w:t>
+      </w:r>
+      <w:r>
+        <w:t xml:space="preserve">and reran the </w:t>
+      </w:r>
+      <w:proofErr w:type="spellStart"/>
+      <w:r>
+        <w:t>HTMLHint</w:t>
+      </w:r>
+      <w:proofErr w:type="spellEnd"/>
+      <w:r>
+        <w:t xml:space="preserve"> command </w:t>
       </w:r>
       <w:r>
         <w:t>with no errors</w:t>
@@ -278,6 +366,9 @@
     </w:p>
     <w:p>
       <w:r>
+        <w:rPr>
+          <w:noProof/>
+        </w:rPr>
         <w:drawing>
           <wp:inline distT="0" distB="0" distL="0" distR="0" wp14:anchorId="1066A622" wp14:editId="6C0B12BB">
             <wp:extent cx="5943600" cy="727075"/>
@@ -317,6 +408,9 @@
     </w:p>
     <w:p>
       <w:r>
+        <w:rPr>
+          <w:noProof/>
+        </w:rPr>
         <w:lastRenderedPageBreak/>
         <w:drawing>
           <wp:inline distT="0" distB="0" distL="0" distR="0" wp14:anchorId="3388C575" wp14:editId="1DCA28B6">
@@ -355,6 +449,104 @@
         </w:drawing>
       </w:r>
     </w:p>
+    <w:p>
+      <w:pPr>
+        <w:pStyle w:val="Heading1"/>
+      </w:pPr>
+      <w:proofErr w:type="spellStart"/>
+      <w:r>
+        <w:t>m</w:t>
+      </w:r>
+      <w:r>
+        <w:t>arkdownlint</w:t>
+      </w:r>
+      <w:proofErr w:type="spellEnd"/>
+      <w:r>
+        <w:t>/</w:t>
+      </w:r>
+      <w:proofErr w:type="spellStart"/>
+      <w:r>
+        <w:t>markdownlint</w:t>
+      </w:r>
+      <w:proofErr w:type="spellEnd"/>
+      <w:r>
+        <w:t>-cli</w:t>
+      </w:r>
+    </w:p>
+    <w:p/>
+    <w:p>
+      <w:pPr>
+        <w:pStyle w:val="Heading1"/>
+      </w:pPr>
+      <w:r>
+        <w:t>markdownlint-cli2</w:t>
+      </w:r>
+    </w:p>
+    <w:p>
+      <w:r>
+        <w:t xml:space="preserve">I installed </w:t>
+      </w:r>
+      <w:r>
+        <w:rPr>
+          <w:b/>
+          <w:bCs/>
+        </w:rPr>
+        <w:t>markdownlint-cli2</w:t>
+      </w:r>
+      <w:r>
+        <w:rPr>
+          <w:b/>
+          <w:bCs/>
+        </w:rPr>
+        <w:t xml:space="preserve"> </w:t>
+      </w:r>
+      <w:r>
+        <w:t>as a global CLI. I copied over a repository containing markdown files and ran the linter over all the Markdown files with the following output.</w:t>
+      </w:r>
+    </w:p>
+    <w:p>
+      <w:r>
+        <w:rPr>
+          <w:noProof/>
+        </w:rPr>
+        <w:drawing>
+          <wp:inline distT="0" distB="0" distL="0" distR="0" wp14:anchorId="4D96834D" wp14:editId="269A4423">
+            <wp:extent cx="5943600" cy="1109345"/>
+            <wp:effectExtent l="0" t="0" r="0" b="0"/>
+            <wp:docPr id="2071608457" name="Picture 1"/>
+            <wp:cNvGraphicFramePr>
+              <a:graphicFrameLocks xmlns:a="http://schemas.openxmlformats.org/drawingml/2006/main" noChangeAspect="1"/>
+            </wp:cNvGraphicFramePr>
+            <a:graphic xmlns:a="http://schemas.openxmlformats.org/drawingml/2006/main">
+              <a:graphicData uri="http://schemas.openxmlformats.org/drawingml/2006/picture">
+                <pic:pic xmlns:pic="http://schemas.openxmlformats.org/drawingml/2006/picture">
+                  <pic:nvPicPr>
+                    <pic:cNvPr id="2071608457" name=""/>
+                    <pic:cNvPicPr/>
+                  </pic:nvPicPr>
+                  <pic:blipFill>
+                    <a:blip r:embed="rId11"/>
+                    <a:stretch>
+                      <a:fillRect/>
+                    </a:stretch>
+                  </pic:blipFill>
+                  <pic:spPr>
+                    <a:xfrm>
+                      <a:off x="0" y="0"/>
+                      <a:ext cx="5943600" cy="1109345"/>
+                    </a:xfrm>
+                    <a:prstGeom prst="rect">
+                      <a:avLst/>
+                    </a:prstGeom>
+                  </pic:spPr>
+                </pic:pic>
+              </a:graphicData>
+            </a:graphic>
+          </wp:inline>
+        </w:drawing>
+      </w:r>
+    </w:p>
+    <w:p/>
     <w:sectPr>
       <w:pgSz w:w="12240" w:h="15840"/>
       <w:pgMar w:top="1440" w:right="1440" w:bottom="1440" w:left="1440" w:header="720" w:footer="720" w:gutter="0"/>

</xml_diff>

<commit_message>
Adding custom markdownlint rule
</commit_message>
<xml_diff>
--- a/Documentation-Quality-Pipeline-Case-Study.docx
+++ b/Documentation-Quality-Pipeline-Case-Study.docx
@@ -473,12 +473,103 @@
         <w:t>-cli</w:t>
       </w:r>
     </w:p>
-    <w:p/>
+    <w:p>
+      <w:r>
+        <w:t xml:space="preserve">I installed </w:t>
+      </w:r>
+      <w:proofErr w:type="spellStart"/>
+      <w:r>
+        <w:t>markdownlint</w:t>
+      </w:r>
+      <w:proofErr w:type="spellEnd"/>
+      <w:r>
+        <w:t xml:space="preserve"> and </w:t>
+      </w:r>
+      <w:proofErr w:type="spellStart"/>
+      <w:r>
+        <w:t>markdownlint</w:t>
+      </w:r>
+      <w:proofErr w:type="spellEnd"/>
+      <w:r>
+        <w:t>-cli</w:t>
+      </w:r>
+    </w:p>
+    <w:p>
+      <w:r>
+        <w:t>I ran it over a directory of Markdown files and output the results into a text file</w:t>
+      </w:r>
+    </w:p>
+    <w:p>
+      <w:r>
+        <w:t xml:space="preserve">I counted the number of lines/errors in the file in PowerShell using </w:t>
+      </w:r>
+      <w:r>
+        <w:rPr>
+          <w:b/>
+          <w:bCs/>
+        </w:rPr>
+        <w:t>(Get-Content markdownLintOutput.txt</w:t>
+      </w:r>
+      <w:proofErr w:type="gramStart"/>
+      <w:r>
+        <w:rPr>
+          <w:b/>
+          <w:bCs/>
+        </w:rPr>
+        <w:t>).Count</w:t>
+      </w:r>
+      <w:proofErr w:type="gramEnd"/>
+    </w:p>
+    <w:p>
+      <w:r>
+        <w:drawing>
+          <wp:inline distT="0" distB="0" distL="0" distR="0" wp14:anchorId="38C51A1C" wp14:editId="28E41407">
+            <wp:extent cx="5943600" cy="2465705"/>
+            <wp:effectExtent l="19050" t="19050" r="19050" b="10795"/>
+            <wp:docPr id="1391765723" name="Picture 1"/>
+            <wp:cNvGraphicFramePr>
+              <a:graphicFrameLocks xmlns:a="http://schemas.openxmlformats.org/drawingml/2006/main" noChangeAspect="1"/>
+            </wp:cNvGraphicFramePr>
+            <a:graphic xmlns:a="http://schemas.openxmlformats.org/drawingml/2006/main">
+              <a:graphicData uri="http://schemas.openxmlformats.org/drawingml/2006/picture">
+                <pic:pic xmlns:pic="http://schemas.openxmlformats.org/drawingml/2006/picture">
+                  <pic:nvPicPr>
+                    <pic:cNvPr id="1391765723" name=""/>
+                    <pic:cNvPicPr/>
+                  </pic:nvPicPr>
+                  <pic:blipFill>
+                    <a:blip r:embed="rId11"/>
+                    <a:stretch>
+                      <a:fillRect/>
+                    </a:stretch>
+                  </pic:blipFill>
+                  <pic:spPr>
+                    <a:xfrm>
+                      <a:off x="0" y="0"/>
+                      <a:ext cx="5943600" cy="2465705"/>
+                    </a:xfrm>
+                    <a:prstGeom prst="rect">
+                      <a:avLst/>
+                    </a:prstGeom>
+                    <a:ln>
+                      <a:solidFill>
+                        <a:schemeClr val="tx1"/>
+                      </a:solidFill>
+                    </a:ln>
+                  </pic:spPr>
+                </pic:pic>
+              </a:graphicData>
+            </a:graphic>
+          </wp:inline>
+        </w:drawing>
+      </w:r>
+    </w:p>
     <w:p>
       <w:pPr>
         <w:pStyle w:val="Heading1"/>
       </w:pPr>
       <w:r>
+        <w:lastRenderedPageBreak/>
         <w:t>markdownlint-cli2</w:t>
       </w:r>
     </w:p>
@@ -525,7 +616,7 @@
                     <pic:cNvPicPr/>
                   </pic:nvPicPr>
                   <pic:blipFill>
-                    <a:blip r:embed="rId11"/>
+                    <a:blip r:embed="rId12"/>
                     <a:stretch>
                       <a:fillRect/>
                     </a:stretch>

</xml_diff>

<commit_message>
Created file to run custom rule over directory of markdown files
</commit_message>
<xml_diff>
--- a/Documentation-Quality-Pipeline-Case-Study.docx
+++ b/Documentation-Quality-Pipeline-Case-Study.docx
@@ -14,21 +14,14 @@
       <w:pPr>
         <w:pStyle w:val="Heading1"/>
       </w:pPr>
-      <w:proofErr w:type="spellStart"/>
       <w:r>
         <w:t>HTMLHint</w:t>
       </w:r>
-      <w:proofErr w:type="spellEnd"/>
-    </w:p>
-    <w:p>
-      <w:r>
-        <w:t xml:space="preserve">Installed </w:t>
-      </w:r>
-      <w:proofErr w:type="spellStart"/>
-      <w:r>
-        <w:t>HTMLHint</w:t>
-      </w:r>
-      <w:proofErr w:type="spellEnd"/>
+    </w:p>
+    <w:p>
+      <w:r>
+        <w:t>Installed HTMLHint</w:t>
+      </w:r>
     </w:p>
     <w:p>
       <w:r>
@@ -36,7 +29,6 @@
       </w:r>
     </w:p>
     <w:p>
-      <w:proofErr w:type="gramStart"/>
       <w:r>
         <w:t xml:space="preserve">Created </w:t>
       </w:r>
@@ -45,59 +37,20 @@
           <w:b/>
           <w:bCs/>
         </w:rPr>
-        <w:t>.</w:t>
-      </w:r>
-      <w:proofErr w:type="spellStart"/>
-      <w:r>
-        <w:rPr>
-          <w:b/>
-          <w:bCs/>
-        </w:rPr>
-        <w:t>htmlhintrc</w:t>
-      </w:r>
-      <w:proofErr w:type="spellEnd"/>
-      <w:proofErr w:type="gramEnd"/>
+        <w:t>.htmlhintrc</w:t>
+      </w:r>
       <w:r>
         <w:t xml:space="preserve"> with default rules</w:t>
       </w:r>
     </w:p>
     <w:p>
       <w:r>
-        <w:t xml:space="preserve">Ran </w:t>
-      </w:r>
-      <w:proofErr w:type="spellStart"/>
-      <w:r>
-        <w:t>HTMLHint</w:t>
-      </w:r>
-      <w:proofErr w:type="spellEnd"/>
-      <w:r>
-        <w:t xml:space="preserve"> on all HTML files in demo project</w:t>
-      </w:r>
-    </w:p>
-    <w:p>
-      <w:r>
-        <w:t xml:space="preserve">Added VS Code schema support to have config </w:t>
-      </w:r>
-      <w:proofErr w:type="gramStart"/>
-      <w:r>
-        <w:t>file</w:t>
-      </w:r>
-      <w:proofErr w:type="gramEnd"/>
-      <w:r>
-        <w:t xml:space="preserve"> recognized by editors with JSON schema support to enable autocompletion and validation for </w:t>
-      </w:r>
-      <w:proofErr w:type="gramStart"/>
-      <w:r>
-        <w:t>the .</w:t>
-      </w:r>
-      <w:proofErr w:type="spellStart"/>
-      <w:r>
-        <w:t>htmlhintrc</w:t>
-      </w:r>
-      <w:proofErr w:type="spellEnd"/>
-      <w:proofErr w:type="gramEnd"/>
-      <w:r>
-        <w:t xml:space="preserve"> file. </w:t>
+        <w:t>Ran HTMLHint on all HTML files in demo project</w:t>
+      </w:r>
+    </w:p>
+    <w:p>
+      <w:r>
+        <w:t xml:space="preserve">Added VS Code schema support to have config file recognized by editors with JSON schema support to enable autocompletion and validation for the .htmlhintrc file. </w:t>
       </w:r>
     </w:p>
     <w:p>
@@ -121,7 +74,7 @@
                     <pic:cNvPicPr/>
                   </pic:nvPicPr>
                   <pic:blipFill>
-                    <a:blip r:embed="rId4"/>
+                    <a:blip r:embed="rId5"/>
                     <a:stretch>
                       <a:fillRect/>
                     </a:stretch>
@@ -164,7 +117,7 @@
                     <pic:cNvPicPr/>
                   </pic:nvPicPr>
                   <pic:blipFill>
-                    <a:blip r:embed="rId5"/>
+                    <a:blip r:embed="rId6"/>
                     <a:stretch>
                       <a:fillRect/>
                     </a:stretch>
@@ -188,23 +141,7 @@
     <w:p/>
     <w:p>
       <w:r>
-        <w:t xml:space="preserve">I created a custom </w:t>
-      </w:r>
-      <w:proofErr w:type="spellStart"/>
-      <w:r>
-        <w:t>HTMLHint</w:t>
-      </w:r>
-      <w:proofErr w:type="spellEnd"/>
-      <w:r>
-        <w:t xml:space="preserve"> configuration file which ensured no style tags cannot be used inside the html. Only references to an external </w:t>
-      </w:r>
-      <w:proofErr w:type="spellStart"/>
-      <w:r>
-        <w:t>css</w:t>
-      </w:r>
-      <w:proofErr w:type="spellEnd"/>
-      <w:r>
-        <w:t xml:space="preserve"> file can be used. D</w:t>
+        <w:t>I created a custom HTMLHint configuration file which ensured no style tags cannot be used inside the html. Only references to an external css file can be used. D</w:t>
       </w:r>
     </w:p>
     <w:p>
@@ -228,7 +165,7 @@
                     <pic:cNvPicPr/>
                   </pic:nvPicPr>
                   <pic:blipFill>
-                    <a:blip r:embed="rId6"/>
+                    <a:blip r:embed="rId7"/>
                     <a:stretch>
                       <a:fillRect/>
                     </a:stretch>
@@ -270,7 +207,7 @@
                     <pic:cNvPicPr/>
                   </pic:nvPicPr>
                   <pic:blipFill>
-                    <a:blip r:embed="rId7"/>
+                    <a:blip r:embed="rId8"/>
                     <a:stretch>
                       <a:fillRect/>
                     </a:stretch>
@@ -313,7 +250,7 @@
                     <pic:cNvPicPr/>
                   </pic:nvPicPr>
                   <pic:blipFill>
-                    <a:blip r:embed="rId8"/>
+                    <a:blip r:embed="rId9"/>
                     <a:stretch>
                       <a:fillRect/>
                     </a:stretch>
@@ -339,26 +276,10 @@
         <w:t xml:space="preserve">I removed the style section from the HTML file </w:t>
       </w:r>
       <w:r>
-        <w:t xml:space="preserve">and put the </w:t>
-      </w:r>
-      <w:proofErr w:type="spellStart"/>
-      <w:r>
-        <w:t>css</w:t>
-      </w:r>
-      <w:proofErr w:type="spellEnd"/>
-      <w:r>
-        <w:t xml:space="preserve"> in a separate file </w:t>
-      </w:r>
-      <w:r>
-        <w:t xml:space="preserve">and reran the </w:t>
-      </w:r>
-      <w:proofErr w:type="spellStart"/>
-      <w:r>
-        <w:t>HTMLHint</w:t>
-      </w:r>
-      <w:proofErr w:type="spellEnd"/>
-      <w:r>
-        <w:t xml:space="preserve"> command </w:t>
+        <w:t xml:space="preserve">and put the css in a separate file </w:t>
+      </w:r>
+      <w:r>
+        <w:t xml:space="preserve">and reran the HTMLHint command </w:t>
       </w:r>
       <w:r>
         <w:t>with no errors</w:t>
@@ -385,7 +306,7 @@
                     <pic:cNvPicPr/>
                   </pic:nvPicPr>
                   <pic:blipFill>
-                    <a:blip r:embed="rId9"/>
+                    <a:blip r:embed="rId10"/>
                     <a:stretch>
                       <a:fillRect/>
                     </a:stretch>
@@ -428,7 +349,7 @@
                     <pic:cNvPicPr/>
                   </pic:nvPicPr>
                   <pic:blipFill>
-                    <a:blip r:embed="rId10"/>
+                    <a:blip r:embed="rId11"/>
                     <a:stretch>
                       <a:fillRect/>
                     </a:stretch>
@@ -453,53 +374,45 @@
       <w:pPr>
         <w:pStyle w:val="Heading1"/>
       </w:pPr>
-      <w:proofErr w:type="spellStart"/>
       <w:r>
         <w:t>m</w:t>
       </w:r>
       <w:r>
-        <w:t>arkdownlint</w:t>
-      </w:r>
-      <w:proofErr w:type="spellEnd"/>
-      <w:r>
-        <w:t>/</w:t>
-      </w:r>
-      <w:proofErr w:type="spellStart"/>
-      <w:r>
-        <w:t>markdownlint</w:t>
-      </w:r>
-      <w:proofErr w:type="spellEnd"/>
-      <w:r>
-        <w:t>-cli</w:t>
-      </w:r>
-    </w:p>
-    <w:p>
-      <w:r>
-        <w:t xml:space="preserve">I installed </w:t>
-      </w:r>
-      <w:proofErr w:type="spellStart"/>
-      <w:r>
-        <w:t>markdownlint</w:t>
-      </w:r>
-      <w:proofErr w:type="spellEnd"/>
-      <w:r>
-        <w:t xml:space="preserve"> and </w:t>
-      </w:r>
-      <w:proofErr w:type="spellStart"/>
-      <w:r>
-        <w:t>markdownlint</w:t>
-      </w:r>
-      <w:proofErr w:type="spellEnd"/>
-      <w:r>
-        <w:t>-cli</w:t>
-      </w:r>
-    </w:p>
-    <w:p>
+        <w:t>arkdownlint/markdownlint-cli</w:t>
+      </w:r>
+    </w:p>
+    <w:p>
+      <w:pPr>
+        <w:pStyle w:val="ListParagraph"/>
+        <w:numPr>
+          <w:ilvl w:val="0"/>
+          <w:numId w:val="1"/>
+        </w:numPr>
+      </w:pPr>
+      <w:r>
+        <w:t>I installed markdownlint and markdownlint-cli</w:t>
+      </w:r>
+    </w:p>
+    <w:p>
+      <w:pPr>
+        <w:pStyle w:val="ListParagraph"/>
+        <w:numPr>
+          <w:ilvl w:val="0"/>
+          <w:numId w:val="1"/>
+        </w:numPr>
+      </w:pPr>
       <w:r>
         <w:t>I ran it over a directory of Markdown files and output the results into a text file</w:t>
       </w:r>
     </w:p>
     <w:p>
+      <w:pPr>
+        <w:pStyle w:val="ListParagraph"/>
+        <w:numPr>
+          <w:ilvl w:val="0"/>
+          <w:numId w:val="1"/>
+        </w:numPr>
+      </w:pPr>
       <w:r>
         <w:t xml:space="preserve">I counted the number of lines/errors in the file in PowerShell using </w:t>
       </w:r>
@@ -508,20 +421,14 @@
           <w:b/>
           <w:bCs/>
         </w:rPr>
-        <w:t>(Get-Content markdownLintOutput.txt</w:t>
-      </w:r>
-      <w:proofErr w:type="gramStart"/>
+        <w:t>(Get-Content markdownLintOutput.txt).Count</w:t>
+      </w:r>
+    </w:p>
+    <w:p>
       <w:r>
         <w:rPr>
-          <w:b/>
-          <w:bCs/>
+          <w:noProof/>
         </w:rPr>
-        <w:t>).Count</w:t>
-      </w:r>
-      <w:proofErr w:type="gramEnd"/>
-    </w:p>
-    <w:p>
-      <w:r>
         <w:drawing>
           <wp:inline distT="0" distB="0" distL="0" distR="0" wp14:anchorId="38C51A1C" wp14:editId="28E41407">
             <wp:extent cx="5943600" cy="2465705"/>
@@ -538,7 +445,7 @@
                     <pic:cNvPicPr/>
                   </pic:nvPicPr>
                   <pic:blipFill>
-                    <a:blip r:embed="rId11"/>
+                    <a:blip r:embed="rId12"/>
                     <a:stretch>
                       <a:fillRect/>
                     </a:stretch>
@@ -565,11 +472,140 @@
       </w:r>
     </w:p>
     <w:p>
+      <w:r>
+        <w:t xml:space="preserve">Created a custom rule </w:t>
+      </w:r>
+      <w:r>
+        <w:rPr>
+          <w:b/>
+          <w:bCs/>
+        </w:rPr>
+        <w:t>period-ending.test.cjs</w:t>
+      </w:r>
+      <w:r>
+        <w:t xml:space="preserve"> that ensures all non-heading, non-blank lines end with a period. </w:t>
+      </w:r>
+    </w:p>
+    <w:p>
+      <w:r>
+        <w:t xml:space="preserve">Created </w:t>
+      </w:r>
+      <w:r>
+        <w:rPr>
+          <w:b/>
+          <w:bCs/>
+        </w:rPr>
+        <w:t>lint-single-file-custom-rule.js</w:t>
+      </w:r>
+      <w:r>
+        <w:t xml:space="preserve"> </w:t>
+      </w:r>
+      <w:r>
+        <w:t>to run my custom rule over a specific file</w:t>
+      </w:r>
+    </w:p>
+    <w:p>
+      <w:r>
+        <w:lastRenderedPageBreak/>
+        <w:t>Sample output:</w:t>
+      </w:r>
+    </w:p>
+    <w:p>
+      <w:r>
+        <w:drawing>
+          <wp:inline distT="0" distB="0" distL="0" distR="0" wp14:anchorId="6E420A44" wp14:editId="1BD80D18">
+            <wp:extent cx="5943600" cy="2861945"/>
+            <wp:effectExtent l="0" t="0" r="0" b="0"/>
+            <wp:docPr id="1092459268" name="Picture 1"/>
+            <wp:cNvGraphicFramePr>
+              <a:graphicFrameLocks xmlns:a="http://schemas.openxmlformats.org/drawingml/2006/main" noChangeAspect="1"/>
+            </wp:cNvGraphicFramePr>
+            <a:graphic xmlns:a="http://schemas.openxmlformats.org/drawingml/2006/main">
+              <a:graphicData uri="http://schemas.openxmlformats.org/drawingml/2006/picture">
+                <pic:pic xmlns:pic="http://schemas.openxmlformats.org/drawingml/2006/picture">
+                  <pic:nvPicPr>
+                    <pic:cNvPr id="1092459268" name=""/>
+                    <pic:cNvPicPr/>
+                  </pic:nvPicPr>
+                  <pic:blipFill>
+                    <a:blip r:embed="rId13"/>
+                    <a:stretch>
+                      <a:fillRect/>
+                    </a:stretch>
+                  </pic:blipFill>
+                  <pic:spPr>
+                    <a:xfrm>
+                      <a:off x="0" y="0"/>
+                      <a:ext cx="5943600" cy="2861945"/>
+                    </a:xfrm>
+                    <a:prstGeom prst="rect">
+                      <a:avLst/>
+                    </a:prstGeom>
+                  </pic:spPr>
+                </pic:pic>
+              </a:graphicData>
+            </a:graphic>
+          </wp:inline>
+        </w:drawing>
+      </w:r>
+    </w:p>
+    <w:p>
+      <w:r>
+        <w:t>Cr</w:t>
+      </w:r>
+      <w:r>
+        <w:t xml:space="preserve">eated script that ran my custom linter over a specified directory. </w:t>
+      </w:r>
+    </w:p>
+    <w:p>
+      <w:r>
+        <w:t>Sample output:</w:t>
+      </w:r>
+    </w:p>
+    <w:p>
+      <w:r>
+        <w:drawing>
+          <wp:inline distT="0" distB="0" distL="0" distR="0" wp14:anchorId="75429C11" wp14:editId="176A2C18">
+            <wp:extent cx="4420217" cy="543001"/>
+            <wp:effectExtent l="0" t="0" r="0" b="9525"/>
+            <wp:docPr id="1856545113" name="Picture 1"/>
+            <wp:cNvGraphicFramePr>
+              <a:graphicFrameLocks xmlns:a="http://schemas.openxmlformats.org/drawingml/2006/main" noChangeAspect="1"/>
+            </wp:cNvGraphicFramePr>
+            <a:graphic xmlns:a="http://schemas.openxmlformats.org/drawingml/2006/main">
+              <a:graphicData uri="http://schemas.openxmlformats.org/drawingml/2006/picture">
+                <pic:pic xmlns:pic="http://schemas.openxmlformats.org/drawingml/2006/picture">
+                  <pic:nvPicPr>
+                    <pic:cNvPr id="1856545113" name=""/>
+                    <pic:cNvPicPr/>
+                  </pic:nvPicPr>
+                  <pic:blipFill>
+                    <a:blip r:embed="rId14"/>
+                    <a:stretch>
+                      <a:fillRect/>
+                    </a:stretch>
+                  </pic:blipFill>
+                  <pic:spPr>
+                    <a:xfrm>
+                      <a:off x="0" y="0"/>
+                      <a:ext cx="4420217" cy="543001"/>
+                    </a:xfrm>
+                    <a:prstGeom prst="rect">
+                      <a:avLst/>
+                    </a:prstGeom>
+                  </pic:spPr>
+                </pic:pic>
+              </a:graphicData>
+            </a:graphic>
+          </wp:inline>
+        </w:drawing>
+      </w:r>
+    </w:p>
+    <w:p>
       <w:pPr>
         <w:pStyle w:val="Heading1"/>
       </w:pPr>
       <w:r>
-        <w:lastRenderedPageBreak/>
         <w:t>markdownlint-cli2</w:t>
       </w:r>
     </w:p>
@@ -616,7 +652,7 @@
                     <pic:cNvPicPr/>
                   </pic:nvPicPr>
                   <pic:blipFill>
-                    <a:blip r:embed="rId12"/>
+                    <a:blip r:embed="rId15"/>
                     <a:stretch>
                       <a:fillRect/>
                     </a:stretch>
@@ -646,6 +682,127 @@
     </w:sectPr>
   </w:body>
 </w:document>
+</file>
+
+<file path=word/numbering.xml><?xml version="1.0" encoding="utf-8"?>
+<w:numbering xmlns:wpc="http://schemas.microsoft.com/office/word/2010/wordprocessingCanvas" xmlns:cx="http://schemas.microsoft.com/office/drawing/2014/chartex" xmlns:cx1="http://schemas.microsoft.com/office/drawing/2015/9/8/chartex" xmlns:cx2="http://schemas.microsoft.com/office/drawing/2015/10/21/chartex" xmlns:cx3="http://schemas.microsoft.com/office/drawing/2016/5/9/chartex" xmlns:cx4="http://schemas.microsoft.com/office/drawing/2016/5/10/chartex" xmlns:cx5="http://schemas.microsoft.com/office/drawing/2016/5/11/chartex" xmlns:cx6="http://schemas.microsoft.com/office/drawing/2016/5/12/chartex" xmlns:cx7="http://schemas.microsoft.com/office/drawing/2016/5/13/chartex" xmlns:cx8="http://schemas.microsoft.com/office/drawing/2016/5/14/chartex" xmlns:mc="http://schemas.openxmlformats.org/markup-compatibility/2006" xmlns:aink="http://schemas.microsoft.com/office/drawing/2016/ink" xmlns:am3d="http://schemas.microsoft.com/office/drawing/2017/model3d" xmlns:o="urn:schemas-microsoft-com:office:office" xmlns:oel="http://schemas.microsoft.com/office/2019/extlst" xmlns:r="http://schemas.openxmlformats.org/officeDocument/2006/relationships" xmlns:m="http://schemas.openxmlformats.org/officeDocument/2006/math" xmlns:v="urn:schemas-microsoft-com:vml" xmlns:wp14="http://schemas.microsoft.com/office/word/2010/wordprocessingDrawing" xmlns:wp="http://schemas.openxmlformats.org/drawingml/2006/wordprocessingDrawing" xmlns:w10="urn:schemas-microsoft-com:office:word" xmlns:w="http://schemas.openxmlformats.org/wordprocessingml/2006/main" xmlns:w14="http://schemas.microsoft.com/office/word/2010/wordml" xmlns:w15="http://schemas.microsoft.com/office/word/2012/wordml" xmlns:w16cex="http://schemas.microsoft.com/office/word/2018/wordml/cex" xmlns:w16cid="http://schemas.microsoft.com/office/word/2016/wordml/cid" xmlns:w16="http://schemas.microsoft.com/office/word/2018/wordml" xmlns:w16du="http://schemas.microsoft.com/office/word/2023/wordml/word16du" xmlns:w16sdtdh="http://schemas.microsoft.com/office/word/2020/wordml/sdtdatahash" xmlns:w16sdtfl="http://schemas.microsoft.com/office/word/2024/wordml/sdtformatlock" xmlns:w16se="http://schemas.microsoft.com/office/word/2015/wordml/symex" xmlns:wpg="http://schemas.microsoft.com/office/word/2010/wordprocessingGroup" xmlns:wpi="http://schemas.microsoft.com/office/word/2010/wordprocessingInk" xmlns:wne="http://schemas.microsoft.com/office/word/2006/wordml" xmlns:wps="http://schemas.microsoft.com/office/word/2010/wordprocessingShape" mc:Ignorable="w14 w15 w16se w16cid w16 w16cex w16sdtdh w16sdtfl w16du wp14">
+  <w:abstractNum w:abstractNumId="0" w15:restartNumberingAfterBreak="0">
+    <w:nsid w:val="0EB141FF"/>
+    <w:multiLevelType w:val="hybridMultilevel"/>
+    <w:tmpl w:val="3B080B50"/>
+    <w:lvl w:ilvl="0" w:tplc="04090001">
+      <w:start w:val="1"/>
+      <w:numFmt w:val="bullet"/>
+      <w:lvlText w:val=""/>
+      <w:lvlJc w:val="left"/>
+      <w:pPr>
+        <w:ind w:left="720" w:hanging="360"/>
+      </w:pPr>
+      <w:rPr>
+        <w:rFonts w:ascii="Symbol" w:hAnsi="Symbol" w:hint="default"/>
+      </w:rPr>
+    </w:lvl>
+    <w:lvl w:ilvl="1" w:tplc="04090003" w:tentative="1">
+      <w:start w:val="1"/>
+      <w:numFmt w:val="bullet"/>
+      <w:lvlText w:val="o"/>
+      <w:lvlJc w:val="left"/>
+      <w:pPr>
+        <w:ind w:left="1440" w:hanging="360"/>
+      </w:pPr>
+      <w:rPr>
+        <w:rFonts w:ascii="Courier New" w:hAnsi="Courier New" w:cs="Courier New" w:hint="default"/>
+      </w:rPr>
+    </w:lvl>
+    <w:lvl w:ilvl="2" w:tplc="04090005" w:tentative="1">
+      <w:start w:val="1"/>
+      <w:numFmt w:val="bullet"/>
+      <w:lvlText w:val=""/>
+      <w:lvlJc w:val="left"/>
+      <w:pPr>
+        <w:ind w:left="2160" w:hanging="360"/>
+      </w:pPr>
+      <w:rPr>
+        <w:rFonts w:ascii="Wingdings" w:hAnsi="Wingdings" w:hint="default"/>
+      </w:rPr>
+    </w:lvl>
+    <w:lvl w:ilvl="3" w:tplc="04090001" w:tentative="1">
+      <w:start w:val="1"/>
+      <w:numFmt w:val="bullet"/>
+      <w:lvlText w:val=""/>
+      <w:lvlJc w:val="left"/>
+      <w:pPr>
+        <w:ind w:left="2880" w:hanging="360"/>
+      </w:pPr>
+      <w:rPr>
+        <w:rFonts w:ascii="Symbol" w:hAnsi="Symbol" w:hint="default"/>
+      </w:rPr>
+    </w:lvl>
+    <w:lvl w:ilvl="4" w:tplc="04090003" w:tentative="1">
+      <w:start w:val="1"/>
+      <w:numFmt w:val="bullet"/>
+      <w:lvlText w:val="o"/>
+      <w:lvlJc w:val="left"/>
+      <w:pPr>
+        <w:ind w:left="3600" w:hanging="360"/>
+      </w:pPr>
+      <w:rPr>
+        <w:rFonts w:ascii="Courier New" w:hAnsi="Courier New" w:cs="Courier New" w:hint="default"/>
+      </w:rPr>
+    </w:lvl>
+    <w:lvl w:ilvl="5" w:tplc="04090005" w:tentative="1">
+      <w:start w:val="1"/>
+      <w:numFmt w:val="bullet"/>
+      <w:lvlText w:val=""/>
+      <w:lvlJc w:val="left"/>
+      <w:pPr>
+        <w:ind w:left="4320" w:hanging="360"/>
+      </w:pPr>
+      <w:rPr>
+        <w:rFonts w:ascii="Wingdings" w:hAnsi="Wingdings" w:hint="default"/>
+      </w:rPr>
+    </w:lvl>
+    <w:lvl w:ilvl="6" w:tplc="04090001" w:tentative="1">
+      <w:start w:val="1"/>
+      <w:numFmt w:val="bullet"/>
+      <w:lvlText w:val=""/>
+      <w:lvlJc w:val="left"/>
+      <w:pPr>
+        <w:ind w:left="5040" w:hanging="360"/>
+      </w:pPr>
+      <w:rPr>
+        <w:rFonts w:ascii="Symbol" w:hAnsi="Symbol" w:hint="default"/>
+      </w:rPr>
+    </w:lvl>
+    <w:lvl w:ilvl="7" w:tplc="04090003" w:tentative="1">
+      <w:start w:val="1"/>
+      <w:numFmt w:val="bullet"/>
+      <w:lvlText w:val="o"/>
+      <w:lvlJc w:val="left"/>
+      <w:pPr>
+        <w:ind w:left="5760" w:hanging="360"/>
+      </w:pPr>
+      <w:rPr>
+        <w:rFonts w:ascii="Courier New" w:hAnsi="Courier New" w:cs="Courier New" w:hint="default"/>
+      </w:rPr>
+    </w:lvl>
+    <w:lvl w:ilvl="8" w:tplc="04090005" w:tentative="1">
+      <w:start w:val="1"/>
+      <w:numFmt w:val="bullet"/>
+      <w:lvlText w:val=""/>
+      <w:lvlJc w:val="left"/>
+      <w:pPr>
+        <w:ind w:left="6480" w:hanging="360"/>
+      </w:pPr>
+      <w:rPr>
+        <w:rFonts w:ascii="Wingdings" w:hAnsi="Wingdings" w:hint="default"/>
+      </w:rPr>
+    </w:lvl>
+  </w:abstractNum>
+  <w:num w:numId="1" w16cid:durableId="1804500660">
+    <w:abstractNumId w:val="0"/>
+  </w:num>
+</w:numbering>
 </file>
 
 <file path=word/styles.xml><?xml version="1.0" encoding="utf-8"?>

</xml_diff>

<commit_message>
Added package.json script; fixed issue with markdownlint-cli2 not running my custom rule
</commit_message>
<xml_diff>
--- a/Documentation-Quality-Pipeline-Case-Study.docx
+++ b/Documentation-Quality-Pipeline-Case-Study.docx
@@ -512,6 +512,9 @@
     </w:p>
     <w:p>
       <w:r>
+        <w:rPr>
+          <w:noProof/>
+        </w:rPr>
         <w:drawing>
           <wp:inline distT="0" distB="0" distL="0" distR="0" wp14:anchorId="6E420A44" wp14:editId="1BD80D18">
             <wp:extent cx="5943600" cy="2861945"/>
@@ -554,7 +557,20 @@
         <w:t>Cr</w:t>
       </w:r>
       <w:r>
-        <w:t xml:space="preserve">eated script that ran my custom linter over a specified directory. </w:t>
+        <w:t xml:space="preserve">eated </w:t>
+      </w:r>
+      <w:r>
+        <w:rPr>
+          <w:b/>
+          <w:bCs/>
+        </w:rPr>
+        <w:t>lint-directory-custom-rule.js</w:t>
+      </w:r>
+      <w:r>
+        <w:t xml:space="preserve"> </w:t>
+      </w:r>
+      <w:r>
+        <w:t xml:space="preserve">script that ran my custom linter over a specified directory. </w:t>
       </w:r>
     </w:p>
     <w:p>
@@ -564,6 +580,9 @@
     </w:p>
     <w:p>
       <w:r>
+        <w:rPr>
+          <w:noProof/>
+        </w:rPr>
         <w:drawing>
           <wp:inline distT="0" distB="0" distL="0" distR="0" wp14:anchorId="75429C11" wp14:editId="176A2C18">
             <wp:extent cx="4420217" cy="543001"/>
@@ -671,6 +690,57 @@
             </a:graphic>
           </wp:inline>
         </w:drawing>
+      </w:r>
+    </w:p>
+    <w:p>
+      <w:r>
+        <w:t>Copied over the</w:t>
+      </w:r>
+      <w:r>
+        <w:rPr>
+          <w:b/>
+          <w:bCs/>
+        </w:rPr>
+        <w:t xml:space="preserve"> </w:t>
+      </w:r>
+      <w:r>
+        <w:rPr>
+          <w:b/>
+          <w:bCs/>
+        </w:rPr>
+        <w:t>period-ending.cjs</w:t>
+      </w:r>
+      <w:r>
+        <w:rPr>
+          <w:b/>
+          <w:bCs/>
+        </w:rPr>
+        <w:t xml:space="preserve"> </w:t>
+      </w:r>
+      <w:r>
+        <w:t xml:space="preserve">custom rule I created. </w:t>
+      </w:r>
+    </w:p>
+    <w:p>
+      <w:r>
+        <w:t xml:space="preserve">Created </w:t>
+      </w:r>
+      <w:r>
+        <w:t>.markdownlint.yaml</w:t>
+      </w:r>
+      <w:r>
+        <w:t xml:space="preserve"> that referenced my custom rule</w:t>
+      </w:r>
+    </w:p>
+    <w:p>
+      <w:r>
+        <w:t xml:space="preserve">Referenced a custom script in package.json to have a repeatable command to use in CI/CD implementations </w:t>
+      </w:r>
+    </w:p>
+    <w:p>
+      <w:r>
+        <w:lastRenderedPageBreak/>
+        <w:t>Created tests for custom rule</w:t>
       </w:r>
     </w:p>
     <w:p/>

</xml_diff>

<commit_message>
Linting and reporting working
</commit_message>
<xml_diff>
--- a/Documentation-Quality-Pipeline-Case-Study.docx
+++ b/Documentation-Quality-Pipeline-Case-Study.docx
@@ -14,14 +14,21 @@
       <w:pPr>
         <w:pStyle w:val="Heading1"/>
       </w:pPr>
+      <w:proofErr w:type="spellStart"/>
       <w:r>
         <w:t>HTMLHint</w:t>
       </w:r>
-    </w:p>
-    <w:p>
-      <w:r>
-        <w:t>Installed HTMLHint</w:t>
-      </w:r>
+      <w:proofErr w:type="spellEnd"/>
+    </w:p>
+    <w:p>
+      <w:r>
+        <w:t xml:space="preserve">Installed </w:t>
+      </w:r>
+      <w:proofErr w:type="spellStart"/>
+      <w:r>
+        <w:t>HTMLHint</w:t>
+      </w:r>
+      <w:proofErr w:type="spellEnd"/>
     </w:p>
     <w:p>
       <w:r>
@@ -29,6 +36,7 @@
       </w:r>
     </w:p>
     <w:p>
+      <w:proofErr w:type="gramStart"/>
       <w:r>
         <w:t xml:space="preserve">Created </w:t>
       </w:r>
@@ -37,20 +45,59 @@
           <w:b/>
           <w:bCs/>
         </w:rPr>
-        <w:t>.htmlhintrc</w:t>
-      </w:r>
+        <w:t>.</w:t>
+      </w:r>
+      <w:proofErr w:type="spellStart"/>
+      <w:r>
+        <w:rPr>
+          <w:b/>
+          <w:bCs/>
+        </w:rPr>
+        <w:t>htmlhintrc</w:t>
+      </w:r>
+      <w:proofErr w:type="spellEnd"/>
+      <w:proofErr w:type="gramEnd"/>
       <w:r>
         <w:t xml:space="preserve"> with default rules</w:t>
       </w:r>
     </w:p>
     <w:p>
       <w:r>
-        <w:t>Ran HTMLHint on all HTML files in demo project</w:t>
-      </w:r>
-    </w:p>
-    <w:p>
-      <w:r>
-        <w:t xml:space="preserve">Added VS Code schema support to have config file recognized by editors with JSON schema support to enable autocompletion and validation for the .htmlhintrc file. </w:t>
+        <w:t xml:space="preserve">Ran </w:t>
+      </w:r>
+      <w:proofErr w:type="spellStart"/>
+      <w:r>
+        <w:t>HTMLHint</w:t>
+      </w:r>
+      <w:proofErr w:type="spellEnd"/>
+      <w:r>
+        <w:t xml:space="preserve"> on all HTML files in demo project</w:t>
+      </w:r>
+    </w:p>
+    <w:p>
+      <w:r>
+        <w:t xml:space="preserve">Added VS Code schema support to have config </w:t>
+      </w:r>
+      <w:proofErr w:type="gramStart"/>
+      <w:r>
+        <w:t>file</w:t>
+      </w:r>
+      <w:proofErr w:type="gramEnd"/>
+      <w:r>
+        <w:t xml:space="preserve"> recognized by editors with JSON schema support to enable autocompletion and validation for </w:t>
+      </w:r>
+      <w:proofErr w:type="gramStart"/>
+      <w:r>
+        <w:t>the .</w:t>
+      </w:r>
+      <w:proofErr w:type="spellStart"/>
+      <w:r>
+        <w:t>htmlhintrc</w:t>
+      </w:r>
+      <w:proofErr w:type="spellEnd"/>
+      <w:proofErr w:type="gramEnd"/>
+      <w:r>
+        <w:t xml:space="preserve"> file. </w:t>
       </w:r>
     </w:p>
     <w:p>
@@ -141,7 +188,23 @@
     <w:p/>
     <w:p>
       <w:r>
-        <w:t>I created a custom HTMLHint configuration file which ensured no style tags cannot be used inside the html. Only references to an external css file can be used. D</w:t>
+        <w:t xml:space="preserve">I created a custom </w:t>
+      </w:r>
+      <w:proofErr w:type="spellStart"/>
+      <w:r>
+        <w:t>HTMLHint</w:t>
+      </w:r>
+      <w:proofErr w:type="spellEnd"/>
+      <w:r>
+        <w:t xml:space="preserve"> configuration file which ensured no style tags cannot be used inside the html. Only references to an external </w:t>
+      </w:r>
+      <w:proofErr w:type="spellStart"/>
+      <w:r>
+        <w:t>css</w:t>
+      </w:r>
+      <w:proofErr w:type="spellEnd"/>
+      <w:r>
+        <w:t xml:space="preserve"> file can be used. D</w:t>
       </w:r>
     </w:p>
     <w:p>
@@ -276,10 +339,26 @@
         <w:t xml:space="preserve">I removed the style section from the HTML file </w:t>
       </w:r>
       <w:r>
-        <w:t xml:space="preserve">and put the css in a separate file </w:t>
-      </w:r>
-      <w:r>
-        <w:t xml:space="preserve">and reran the HTMLHint command </w:t>
+        <w:t xml:space="preserve">and put the </w:t>
+      </w:r>
+      <w:proofErr w:type="spellStart"/>
+      <w:r>
+        <w:t>css</w:t>
+      </w:r>
+      <w:proofErr w:type="spellEnd"/>
+      <w:r>
+        <w:t xml:space="preserve"> in a separate file </w:t>
+      </w:r>
+      <w:r>
+        <w:t xml:space="preserve">and reran the </w:t>
+      </w:r>
+      <w:proofErr w:type="spellStart"/>
+      <w:r>
+        <w:t>HTMLHint</w:t>
+      </w:r>
+      <w:proofErr w:type="spellEnd"/>
+      <w:r>
+        <w:t xml:space="preserve"> command </w:t>
       </w:r>
       <w:r>
         <w:t>with no errors</w:t>
@@ -374,11 +453,24 @@
       <w:pPr>
         <w:pStyle w:val="Heading1"/>
       </w:pPr>
+      <w:proofErr w:type="spellStart"/>
       <w:r>
         <w:t>m</w:t>
       </w:r>
       <w:r>
-        <w:t>arkdownlint/markdownlint-cli</w:t>
+        <w:t>arkdownlint</w:t>
+      </w:r>
+      <w:proofErr w:type="spellEnd"/>
+      <w:r>
+        <w:t>/</w:t>
+      </w:r>
+      <w:proofErr w:type="spellStart"/>
+      <w:r>
+        <w:t>markdownlint</w:t>
+      </w:r>
+      <w:proofErr w:type="spellEnd"/>
+      <w:r>
+        <w:t>-cli</w:t>
       </w:r>
     </w:p>
     <w:p>
@@ -390,7 +482,23 @@
         </w:numPr>
       </w:pPr>
       <w:r>
-        <w:t>I installed markdownlint and markdownlint-cli</w:t>
+        <w:t xml:space="preserve">I installed </w:t>
+      </w:r>
+      <w:proofErr w:type="spellStart"/>
+      <w:r>
+        <w:t>markdownlint</w:t>
+      </w:r>
+      <w:proofErr w:type="spellEnd"/>
+      <w:r>
+        <w:t xml:space="preserve"> and </w:t>
+      </w:r>
+      <w:proofErr w:type="spellStart"/>
+      <w:r>
+        <w:t>markdownlint</w:t>
+      </w:r>
+      <w:proofErr w:type="spellEnd"/>
+      <w:r>
+        <w:t>-cli</w:t>
       </w:r>
     </w:p>
     <w:p>
@@ -421,8 +529,17 @@
           <w:b/>
           <w:bCs/>
         </w:rPr>
-        <w:t>(Get-Content markdownLintOutput.txt).Count</w:t>
-      </w:r>
+        <w:t>(Get-Content markdownLintOutput.txt</w:t>
+      </w:r>
+      <w:proofErr w:type="gramStart"/>
+      <w:r>
+        <w:rPr>
+          <w:b/>
+          <w:bCs/>
+        </w:rPr>
+        <w:t>).Count</w:t>
+      </w:r>
+      <w:proofErr w:type="gramEnd"/>
     </w:p>
     <w:p>
       <w:r>
@@ -480,8 +597,17 @@
           <w:b/>
           <w:bCs/>
         </w:rPr>
-        <w:t>period-ending.test.cjs</w:t>
-      </w:r>
+        <w:t>period-</w:t>
+      </w:r>
+      <w:proofErr w:type="spellStart"/>
+      <w:r>
+        <w:rPr>
+          <w:b/>
+          <w:bCs/>
+        </w:rPr>
+        <w:t>ending.test.cjs</w:t>
+      </w:r>
+      <w:proofErr w:type="spellEnd"/>
       <w:r>
         <w:t xml:space="preserve"> that ensures all non-heading, non-blank lines end with a period. </w:t>
       </w:r>
@@ -693,6 +819,13 @@
       </w:r>
     </w:p>
     <w:p>
+      <w:pPr>
+        <w:pStyle w:val="ListParagraph"/>
+        <w:numPr>
+          <w:ilvl w:val="0"/>
+          <w:numId w:val="2"/>
+        </w:numPr>
+      </w:pPr>
       <w:r>
         <w:t>Copied over the</w:t>
       </w:r>
@@ -708,8 +841,17 @@
           <w:b/>
           <w:bCs/>
         </w:rPr>
-        <w:t>period-ending.cjs</w:t>
-      </w:r>
+        <w:t>period-</w:t>
+      </w:r>
+      <w:proofErr w:type="spellStart"/>
+      <w:r>
+        <w:rPr>
+          <w:b/>
+          <w:bCs/>
+        </w:rPr>
+        <w:t>ending.cjs</w:t>
+      </w:r>
+      <w:proofErr w:type="spellEnd"/>
       <w:r>
         <w:rPr>
           <w:b/>
@@ -722,25 +864,180 @@
       </w:r>
     </w:p>
     <w:p>
+      <w:pPr>
+        <w:pStyle w:val="ListParagraph"/>
+        <w:numPr>
+          <w:ilvl w:val="0"/>
+          <w:numId w:val="2"/>
+        </w:numPr>
+      </w:pPr>
+      <w:proofErr w:type="gramStart"/>
       <w:r>
         <w:t xml:space="preserve">Created </w:t>
       </w:r>
       <w:r>
-        <w:t>.markdownlint.yaml</w:t>
-      </w:r>
+        <w:t>.</w:t>
+      </w:r>
+      <w:proofErr w:type="spellStart"/>
+      <w:r>
+        <w:t>markdownlint</w:t>
+      </w:r>
+      <w:proofErr w:type="gramEnd"/>
+      <w:r>
+        <w:t>.yaml</w:t>
+      </w:r>
+      <w:proofErr w:type="spellEnd"/>
       <w:r>
         <w:t xml:space="preserve"> that referenced my custom rule</w:t>
       </w:r>
     </w:p>
     <w:p>
-      <w:r>
-        <w:t xml:space="preserve">Referenced a custom script in package.json to have a repeatable command to use in CI/CD implementations </w:t>
-      </w:r>
-    </w:p>
-    <w:p>
+      <w:pPr>
+        <w:pStyle w:val="ListParagraph"/>
+        <w:numPr>
+          <w:ilvl w:val="0"/>
+          <w:numId w:val="2"/>
+        </w:numPr>
+      </w:pPr>
+      <w:r>
+        <w:t xml:space="preserve">Referenced a custom script in </w:t>
+      </w:r>
+      <w:proofErr w:type="spellStart"/>
+      <w:proofErr w:type="gramStart"/>
+      <w:r>
+        <w:t>package.json</w:t>
+      </w:r>
+      <w:proofErr w:type="spellEnd"/>
+      <w:proofErr w:type="gramEnd"/>
+      <w:r>
+        <w:t xml:space="preserve"> to have a repeatable command to use in CI/CD implementations </w:t>
+      </w:r>
+    </w:p>
+    <w:p>
+      <w:pPr>
+        <w:pStyle w:val="ListParagraph"/>
+        <w:numPr>
+          <w:ilvl w:val="0"/>
+          <w:numId w:val="2"/>
+        </w:numPr>
+      </w:pPr>
       <w:r>
         <w:lastRenderedPageBreak/>
         <w:t>Created tests for custom rule</w:t>
+      </w:r>
+    </w:p>
+    <w:p>
+      <w:pPr>
+        <w:pStyle w:val="ListParagraph"/>
+        <w:numPr>
+          <w:ilvl w:val="0"/>
+          <w:numId w:val="2"/>
+        </w:numPr>
+      </w:pPr>
+      <w:r>
+        <w:t>Resolved issue with markdownlint-cli2 not running my custom command</w:t>
+      </w:r>
+    </w:p>
+    <w:p>
+      <w:pPr>
+        <w:pStyle w:val="ListParagraph"/>
+        <w:numPr>
+          <w:ilvl w:val="1"/>
+          <w:numId w:val="2"/>
+        </w:numPr>
+      </w:pPr>
+      <w:r>
+        <w:t xml:space="preserve">Renamed </w:t>
+      </w:r>
+      <w:proofErr w:type="spellStart"/>
+      <w:r>
+        <w:t>yaml</w:t>
+      </w:r>
+      <w:proofErr w:type="spellEnd"/>
+      <w:r>
+        <w:t xml:space="preserve"> configuration file </w:t>
+      </w:r>
+      <w:proofErr w:type="gramStart"/>
+      <w:r>
+        <w:t>from .</w:t>
+      </w:r>
+      <w:proofErr w:type="spellStart"/>
+      <w:r>
+        <w:t>markdownlint</w:t>
+      </w:r>
+      <w:proofErr w:type="gramEnd"/>
+      <w:r>
+        <w:t>.yaml</w:t>
+      </w:r>
+      <w:proofErr w:type="spellEnd"/>
+      <w:r>
+        <w:t xml:space="preserve"> </w:t>
+      </w:r>
+      <w:proofErr w:type="gramStart"/>
+      <w:r>
+        <w:t>to .markdownlint</w:t>
+      </w:r>
+      <w:proofErr w:type="gramEnd"/>
+      <w:r>
+        <w:t>-cli2.yaml</w:t>
+      </w:r>
+    </w:p>
+    <w:p>
+      <w:pPr>
+        <w:pStyle w:val="ListParagraph"/>
+        <w:numPr>
+          <w:ilvl w:val="0"/>
+          <w:numId w:val="2"/>
+        </w:numPr>
+      </w:pPr>
+      <w:r>
+        <w:t xml:space="preserve">Output the findings into a reports file with </w:t>
+      </w:r>
+      <w:r>
+        <w:rPr>
+          <w:b/>
+          <w:bCs/>
+        </w:rPr>
+        <w:t>node lint.js</w:t>
+      </w:r>
+    </w:p>
+    <w:p>
+      <w:r>
+        <w:drawing>
+          <wp:inline distT="0" distB="0" distL="0" distR="0" wp14:anchorId="720B2D9E" wp14:editId="775709E3">
+            <wp:extent cx="5943600" cy="3632200"/>
+            <wp:effectExtent l="0" t="0" r="0" b="6350"/>
+            <wp:docPr id="742510327" name="Picture 1"/>
+            <wp:cNvGraphicFramePr>
+              <a:graphicFrameLocks xmlns:a="http://schemas.openxmlformats.org/drawingml/2006/main" noChangeAspect="1"/>
+            </wp:cNvGraphicFramePr>
+            <a:graphic xmlns:a="http://schemas.openxmlformats.org/drawingml/2006/main">
+              <a:graphicData uri="http://schemas.openxmlformats.org/drawingml/2006/picture">
+                <pic:pic xmlns:pic="http://schemas.openxmlformats.org/drawingml/2006/picture">
+                  <pic:nvPicPr>
+                    <pic:cNvPr id="742510327" name=""/>
+                    <pic:cNvPicPr/>
+                  </pic:nvPicPr>
+                  <pic:blipFill>
+                    <a:blip r:embed="rId16"/>
+                    <a:stretch>
+                      <a:fillRect/>
+                    </a:stretch>
+                  </pic:blipFill>
+                  <pic:spPr>
+                    <a:xfrm>
+                      <a:off x="0" y="0"/>
+                      <a:ext cx="5943600" cy="3632200"/>
+                    </a:xfrm>
+                    <a:prstGeom prst="rect">
+                      <a:avLst/>
+                    </a:prstGeom>
+                  </pic:spPr>
+                </pic:pic>
+              </a:graphicData>
+            </a:graphic>
+          </wp:inline>
+        </w:drawing>
       </w:r>
     </w:p>
     <w:p/>
@@ -869,8 +1166,124 @@
       </w:rPr>
     </w:lvl>
   </w:abstractNum>
+  <w:abstractNum w:abstractNumId="1" w15:restartNumberingAfterBreak="0">
+    <w:nsid w:val="51225B39"/>
+    <w:multiLevelType w:val="hybridMultilevel"/>
+    <w:tmpl w:val="EBBACC98"/>
+    <w:lvl w:ilvl="0" w:tplc="04090001">
+      <w:start w:val="1"/>
+      <w:numFmt w:val="bullet"/>
+      <w:lvlText w:val=""/>
+      <w:lvlJc w:val="left"/>
+      <w:pPr>
+        <w:ind w:left="720" w:hanging="360"/>
+      </w:pPr>
+      <w:rPr>
+        <w:rFonts w:ascii="Symbol" w:hAnsi="Symbol" w:hint="default"/>
+      </w:rPr>
+    </w:lvl>
+    <w:lvl w:ilvl="1" w:tplc="04090003">
+      <w:start w:val="1"/>
+      <w:numFmt w:val="bullet"/>
+      <w:lvlText w:val="o"/>
+      <w:lvlJc w:val="left"/>
+      <w:pPr>
+        <w:ind w:left="1440" w:hanging="360"/>
+      </w:pPr>
+      <w:rPr>
+        <w:rFonts w:ascii="Courier New" w:hAnsi="Courier New" w:cs="Courier New" w:hint="default"/>
+      </w:rPr>
+    </w:lvl>
+    <w:lvl w:ilvl="2" w:tplc="04090005" w:tentative="1">
+      <w:start w:val="1"/>
+      <w:numFmt w:val="bullet"/>
+      <w:lvlText w:val=""/>
+      <w:lvlJc w:val="left"/>
+      <w:pPr>
+        <w:ind w:left="2160" w:hanging="360"/>
+      </w:pPr>
+      <w:rPr>
+        <w:rFonts w:ascii="Wingdings" w:hAnsi="Wingdings" w:hint="default"/>
+      </w:rPr>
+    </w:lvl>
+    <w:lvl w:ilvl="3" w:tplc="04090001" w:tentative="1">
+      <w:start w:val="1"/>
+      <w:numFmt w:val="bullet"/>
+      <w:lvlText w:val=""/>
+      <w:lvlJc w:val="left"/>
+      <w:pPr>
+        <w:ind w:left="2880" w:hanging="360"/>
+      </w:pPr>
+      <w:rPr>
+        <w:rFonts w:ascii="Symbol" w:hAnsi="Symbol" w:hint="default"/>
+      </w:rPr>
+    </w:lvl>
+    <w:lvl w:ilvl="4" w:tplc="04090003" w:tentative="1">
+      <w:start w:val="1"/>
+      <w:numFmt w:val="bullet"/>
+      <w:lvlText w:val="o"/>
+      <w:lvlJc w:val="left"/>
+      <w:pPr>
+        <w:ind w:left="3600" w:hanging="360"/>
+      </w:pPr>
+      <w:rPr>
+        <w:rFonts w:ascii="Courier New" w:hAnsi="Courier New" w:cs="Courier New" w:hint="default"/>
+      </w:rPr>
+    </w:lvl>
+    <w:lvl w:ilvl="5" w:tplc="04090005" w:tentative="1">
+      <w:start w:val="1"/>
+      <w:numFmt w:val="bullet"/>
+      <w:lvlText w:val=""/>
+      <w:lvlJc w:val="left"/>
+      <w:pPr>
+        <w:ind w:left="4320" w:hanging="360"/>
+      </w:pPr>
+      <w:rPr>
+        <w:rFonts w:ascii="Wingdings" w:hAnsi="Wingdings" w:hint="default"/>
+      </w:rPr>
+    </w:lvl>
+    <w:lvl w:ilvl="6" w:tplc="04090001" w:tentative="1">
+      <w:start w:val="1"/>
+      <w:numFmt w:val="bullet"/>
+      <w:lvlText w:val=""/>
+      <w:lvlJc w:val="left"/>
+      <w:pPr>
+        <w:ind w:left="5040" w:hanging="360"/>
+      </w:pPr>
+      <w:rPr>
+        <w:rFonts w:ascii="Symbol" w:hAnsi="Symbol" w:hint="default"/>
+      </w:rPr>
+    </w:lvl>
+    <w:lvl w:ilvl="7" w:tplc="04090003" w:tentative="1">
+      <w:start w:val="1"/>
+      <w:numFmt w:val="bullet"/>
+      <w:lvlText w:val="o"/>
+      <w:lvlJc w:val="left"/>
+      <w:pPr>
+        <w:ind w:left="5760" w:hanging="360"/>
+      </w:pPr>
+      <w:rPr>
+        <w:rFonts w:ascii="Courier New" w:hAnsi="Courier New" w:cs="Courier New" w:hint="default"/>
+      </w:rPr>
+    </w:lvl>
+    <w:lvl w:ilvl="8" w:tplc="04090005" w:tentative="1">
+      <w:start w:val="1"/>
+      <w:numFmt w:val="bullet"/>
+      <w:lvlText w:val=""/>
+      <w:lvlJc w:val="left"/>
+      <w:pPr>
+        <w:ind w:left="6480" w:hanging="360"/>
+      </w:pPr>
+      <w:rPr>
+        <w:rFonts w:ascii="Wingdings" w:hAnsi="Wingdings" w:hint="default"/>
+      </w:rPr>
+    </w:lvl>
+  </w:abstractNum>
   <w:num w:numId="1" w16cid:durableId="1804500660">
     <w:abstractNumId w:val="0"/>
+  </w:num>
+  <w:num w:numId="2" w16cid:durableId="1667660546">
+    <w:abstractNumId w:val="1"/>
   </w:num>
 </w:numbering>
 </file>

</xml_diff>

<commit_message>
Update .ini file to include Readability checks
</commit_message>
<xml_diff>
--- a/Documentation-Quality-Pipeline-Case-Study.docx
+++ b/Documentation-Quality-Pipeline-Case-Study.docx
@@ -2476,6 +2476,9 @@
     </w:p>
     <w:p>
       <w:r>
+        <w:rPr>
+          <w:noProof/>
+        </w:rPr>
         <w:drawing>
           <wp:inline distT="0" distB="0" distL="0" distR="0" wp14:anchorId="7CE79E7E" wp14:editId="0FEF9B06">
             <wp:extent cx="5943600" cy="2926715"/>
@@ -2545,6 +2548,116 @@
     </w:p>
     <w:p>
       <w:pPr>
+        <w:pStyle w:val="Heading2"/>
+      </w:pPr>
+      <w:r>
+        <w:t>Lint Results</w:t>
+      </w:r>
+    </w:p>
+    <w:p>
+      <w:proofErr w:type="gramStart"/>
+      <w:r>
+        <w:t>vale .</w:t>
+      </w:r>
+      <w:proofErr w:type="gramEnd"/>
+      <w:r>
+        <w:t>\README.md</w:t>
+      </w:r>
+    </w:p>
+    <w:p>
+      <w:r>
+        <w:drawing>
+          <wp:inline distT="0" distB="0" distL="0" distR="0" wp14:anchorId="2C2AF6E8" wp14:editId="57FEB877">
+            <wp:extent cx="5943600" cy="2409825"/>
+            <wp:effectExtent l="0" t="0" r="0" b="9525"/>
+            <wp:docPr id="1296764675" name="Picture 1"/>
+            <wp:cNvGraphicFramePr>
+              <a:graphicFrameLocks xmlns:a="http://schemas.openxmlformats.org/drawingml/2006/main" noChangeAspect="1"/>
+            </wp:cNvGraphicFramePr>
+            <a:graphic xmlns:a="http://schemas.openxmlformats.org/drawingml/2006/main">
+              <a:graphicData uri="http://schemas.openxmlformats.org/drawingml/2006/picture">
+                <pic:pic xmlns:pic="http://schemas.openxmlformats.org/drawingml/2006/picture">
+                  <pic:nvPicPr>
+                    <pic:cNvPr id="1296764675" name=""/>
+                    <pic:cNvPicPr/>
+                  </pic:nvPicPr>
+                  <pic:blipFill>
+                    <a:blip r:embed="rId28"/>
+                    <a:stretch>
+                      <a:fillRect/>
+                    </a:stretch>
+                  </pic:blipFill>
+                  <pic:spPr>
+                    <a:xfrm>
+                      <a:off x="0" y="0"/>
+                      <a:ext cx="5943600" cy="2409825"/>
+                    </a:xfrm>
+                    <a:prstGeom prst="rect">
+                      <a:avLst/>
+                    </a:prstGeom>
+                  </pic:spPr>
+                </pic:pic>
+              </a:graphicData>
+            </a:graphic>
+          </wp:inline>
+        </w:drawing>
+      </w:r>
+    </w:p>
+    <w:p>
+      <w:r>
+        <w:drawing>
+          <wp:inline distT="0" distB="0" distL="0" distR="0" wp14:anchorId="5015005F" wp14:editId="69CD32D7">
+            <wp:extent cx="5943600" cy="2728595"/>
+            <wp:effectExtent l="0" t="0" r="0" b="0"/>
+            <wp:docPr id="1243383271" name="Picture 1"/>
+            <wp:cNvGraphicFramePr>
+              <a:graphicFrameLocks xmlns:a="http://schemas.openxmlformats.org/drawingml/2006/main" noChangeAspect="1"/>
+            </wp:cNvGraphicFramePr>
+            <a:graphic xmlns:a="http://schemas.openxmlformats.org/drawingml/2006/main">
+              <a:graphicData uri="http://schemas.openxmlformats.org/drawingml/2006/picture">
+                <pic:pic xmlns:pic="http://schemas.openxmlformats.org/drawingml/2006/picture">
+                  <pic:nvPicPr>
+                    <pic:cNvPr id="1243383271" name=""/>
+                    <pic:cNvPicPr/>
+                  </pic:nvPicPr>
+                  <pic:blipFill>
+                    <a:blip r:embed="rId29"/>
+                    <a:stretch>
+                      <a:fillRect/>
+                    </a:stretch>
+                  </pic:blipFill>
+                  <pic:spPr>
+                    <a:xfrm>
+                      <a:off x="0" y="0"/>
+                      <a:ext cx="5943600" cy="2728595"/>
+                    </a:xfrm>
+                    <a:prstGeom prst="rect">
+                      <a:avLst/>
+                    </a:prstGeom>
+                  </pic:spPr>
+                </pic:pic>
+              </a:graphicData>
+            </a:graphic>
+          </wp:inline>
+        </w:drawing>
+      </w:r>
+    </w:p>
+    <w:p>
+      <w:r>
+        <w:t xml:space="preserve">Created a Vale configuration file that scores readability and </w:t>
+      </w:r>
+      <w:proofErr w:type="gramStart"/>
+      <w:r>
+        <w:t>suggest</w:t>
+      </w:r>
+      <w:proofErr w:type="gramEnd"/>
+      <w:r>
+        <w:t xml:space="preserve"> adherence to Microsoft style guide. </w:t>
+      </w:r>
+    </w:p>
+    <w:p/>
+    <w:p>
+      <w:pPr>
         <w:pStyle w:val="Heading1"/>
       </w:pPr>
       <w:r>
@@ -2717,7 +2830,7 @@
       </w:r>
     </w:p>
     <w:p>
-      <w:hyperlink r:id="rId28" w:history="1">
+      <w:hyperlink r:id="rId30" w:history="1">
         <w:r>
           <w:rPr>
             <w:rStyle w:val="Hyperlink"/>
@@ -4754,6 +4867,7 @@
   <w:style w:type="character" w:default="1" w:styleId="DefaultParagraphFont">
     <w:name w:val="Default Paragraph Font"/>
     <w:uiPriority w:val="1"/>
+    <w:semiHidden/>
     <w:unhideWhenUsed/>
   </w:style>
   <w:style w:type="table" w:default="1" w:styleId="TableNormal">

</xml_diff>